<commit_message>
Redesign About Me as a dark luxurious gradient spotlight card with big direct heading; update university to Mustaqbal University across site; regenerate resume docx
</commit_message>
<xml_diff>
--- a/assets/files/Lamya_Abdulatif_Resume.docx
+++ b/assets/files/Lamya_Abdulatif_Resume.docx
@@ -137,7 +137,7 @@
           <w:sz w:val="20"/>
           <w:szCs w:val="20"/>
         </w:rPr>
-        <w:t xml:space="preserve">Computer Engineering student at Qassim University (expected graduation: 2026) with a strong foundation in software development, artificial intelligence, cloud computing, and data analytics. Experienced in building AI-powered RAG applications, cloud-deployed infrastructure, and embedded systems, with strong analytical, problem-solving, and teamwork skills. Eager to contribute to innovative organizations while continuously growing as an engineer.</w:t>
+        <w:t xml:space="preserve">Computer Engineering student at Mustaqbal University (expected graduation: 2026) with a strong foundation in software development, artificial intelligence, cloud computing, and data analytics. Experienced in building AI-powered RAG applications, cloud-deployed infrastructure, and embedded systems, with strong analytical, problem-solving, and teamwork skills. Eager to contribute to innovative organizations while continuously growing as an engineer.</w:t>
       </w:r>
     </w:p>
     <w:p>
@@ -1084,7 +1084,7 @@
           <w:sz w:val="20"/>
           <w:szCs w:val="20"/>
         </w:rPr>
-        <w:t xml:space="preserve">Qassim University</w:t>
+        <w:t xml:space="preserve">Mustaqbal University</w:t>
       </w:r>
       <w:r>
         <w:rPr>

</xml_diff>